<commit_message>
Aggiungi caviglia reattiva e cuffia dei rotatori alla scheda Under17 Elite
Dalle schede Serie D emergono due elementi identitari della pallavolo
non ancora presenti: caviglia reattiva (sollevamento sulle punte, dentro
il blocco squat come nel modello Serie D) e salute della spalla di
attacco (cuffia dei rotatori con elastico, dentro il blocco spinta/
trazione).

Co-Authored-By: Claude Sonnet 5 <noreply@anthropic.com>
Claude-Session: https://claude.ai/code/session_018kVL26YvLwg9VAFsx4evJX
</commit_message>
<xml_diff>
--- a/under17-elite/Under17 Elite - Forza 45 minuti.docx
+++ b/under17-elite/Under17 Elite - Forza 45 minuti.docx
@@ -57,6 +57,18 @@
     </w:p>
     <w:p>
       <w:pPr>
+        <w:pStyle w:val="ListParagraph"/>
+        <w:numPr>
+          <w:ilvl w:val="0"/>
+          <w:numId w:val="2"/>
+        </w:numPr>
+      </w:pPr>
+      <w:r>
+        <w:t>Sollevamento sulle punte — 1 × 15 a gambe tese, poi 1 × 12 a ginocchia piegate</w:t>
+      </w:r>
+    </w:p>
+    <w:p>
+      <w:pPr>
         <w:pStyle w:val="Heading3"/>
       </w:pPr>
       <w:r>
@@ -117,6 +129,18 @@
       </w:pPr>
       <w:r>
         <w:t>Trazioni alla sbarra, assistite con elastico se necessario — 3 × 6-8 (alternativa: rematore con bilanciere)</w:t>
+      </w:r>
+    </w:p>
+    <w:p>
+      <w:pPr>
+        <w:pStyle w:val="ListParagraph"/>
+        <w:numPr>
+          <w:ilvl w:val="0"/>
+          <w:numId w:val="2"/>
+        </w:numPr>
+      </w:pPr>
+      <w:r>
+        <w:t>Cuffia dei rotatori con elastico — 2 × 15 per lato</w:t>
       </w:r>
     </w:p>
     <w:p>

</xml_diff>

<commit_message>
Riequilibra spinta/trazione a 2:1 nella scheda Under17 Elite
La letteratura su pallavolo e salute della spalla (schiacciata e battuta
gia caricano la spalla in spinta) raccomanda un rapporto tirare:spingere
di circa 2:1, non 1:1. Aggiunto rematore come seconda trazione nella
Stazione 3, dopo ricerca su strength and conditioning per pallavolo,
prevenzione infortuni di spalla/ACL e periodizzazione per atlete
giovanili elite.

Co-Authored-By: Claude Sonnet 5 <noreply@anthropic.com>
Claude-Session: https://claude.ai/code/session_018kVL26YvLwg9VAFsx4evJX
</commit_message>
<xml_diff>
--- a/under17-elite/Under17 Elite - Forza 45 minuti.docx
+++ b/under17-elite/Under17 Elite - Forza 45 minuti.docx
@@ -108,6 +108,11 @@
       </w:r>
     </w:p>
     <w:p>
+      <w:r>
+        <w:t>Rapporto 2:1 tra tirare e spingere: la schiacciata carica già la spalla in spinta, qui si bilancia con la trazione.</w:t>
+      </w:r>
+    </w:p>
+    <w:p>
       <w:pPr>
         <w:pStyle w:val="ListParagraph"/>
         <w:numPr>
@@ -128,7 +133,19 @@
         </w:numPr>
       </w:pPr>
       <w:r>
-        <w:t>Trazioni alla sbarra, assistite con elastico se necessario — 3 × 6-8 (alternativa: rematore con bilanciere)</w:t>
+        <w:t>Trazioni alla sbarra, assistite con elastico se necessario — 3 × 6-8</w:t>
+      </w:r>
+    </w:p>
+    <w:p>
+      <w:pPr>
+        <w:pStyle w:val="ListParagraph"/>
+        <w:numPr>
+          <w:ilvl w:val="0"/>
+          <w:numId w:val="2"/>
+        </w:numPr>
+      </w:pPr>
+      <w:r>
+        <w:t>Rematore con bilanciere — 2 × 10</w:t>
       </w:r>
     </w:p>
     <w:p>

</xml_diff>

<commit_message>
Ristruttura la scheda Under17 Elite in 8 stazioni a coppie in rotazione
Materiale insufficiente per quartetti: si lavora a coppie, un attrezzo
a testa condiviso, come nel modello Serie D (mentre una lavora, l'altra
recupera accanto all'attrezzo). 8 stazioni rotanti da 5' e mezzo, 44
minuti totali. Serie principali ridotte da 3 a 2 per il tempo più
stretto per stazione; caviglia reattiva e cuffia dei rotatori restano
come accessorio dentro le stazioni squat e panca invece di uno slot
dedicato. Rapporto 2:1 tirare:spingere confermato su tre stazioni
distinte (panca, trazioni, rematore).

Co-Authored-By: Claude Sonnet 5 <noreply@anthropic.com>
Claude-Session: https://claude.ai/code/session_018kVL26YvLwg9VAFsx4evJX
</commit_message>
<xml_diff>
--- a/under17-elite/Under17 Elite - Forza 45 minuti.docx
+++ b/under17-elite/Under17 Elite - Forza 45 minuti.docx
@@ -20,27 +20,47 @@
     </w:p>
     <w:p>
       <w:r>
-        <w:t>16 atlete, 4 stazioni da 4. Rotazione ogni 10 minuti, 1 minuto per il cambio: 4 giri, 44 minuti totali. Bilancieri e manubri a sufficienza in ogni stazione, si lavora tutte insieme senza attese.</w:t>
-      </w:r>
-    </w:p>
-    <w:p>
-      <w:pPr>
-        <w:pStyle w:val="Heading3"/>
-      </w:pPr>
-      <w:r>
-        <w:t>Stazione 1 — Squat — 10 minuti</w:t>
-      </w:r>
-    </w:p>
-    <w:p>
-      <w:pPr>
-        <w:pStyle w:val="ListParagraph"/>
-        <w:numPr>
-          <w:ilvl w:val="0"/>
-          <w:numId w:val="2"/>
-        </w:numPr>
-      </w:pPr>
-      <w:r>
-        <w:t>Squat con bilanciere — 3 × 5, discesa in 3 secondi, margine 3 (chi non ha ancora i requisiti tecnici: goblet squat con manubrio)</w:t>
+        <w:t>16 atlete in 8 coppie, un bilanciere (o attrezzo) a coppia: il materiale non basta per lavorare in quartetti. A coppie: mentre una lavora l'altra recupera accanto all'attrezzo, poi si scambiano, come nel modello Serie D. Rotazione ogni 5 minuti e mezzo: 8 giri, 44 minuti totali.</w:t>
+      </w:r>
+    </w:p>
+    <w:p>
+      <w:pPr>
+        <w:pStyle w:val="Heading3"/>
+      </w:pPr>
+      <w:r>
+        <w:t>Stazione 1 — Squat</w:t>
+      </w:r>
+    </w:p>
+    <w:p>
+      <w:pPr>
+        <w:pStyle w:val="ListParagraph"/>
+        <w:numPr>
+          <w:ilvl w:val="0"/>
+          <w:numId w:val="2"/>
+        </w:numPr>
+      </w:pPr>
+      <w:r>
+        <w:t>Squat con bilanciere — 2 × 5, discesa in 3 secondi, margine 3 (chi non ha ancora i requisiti tecnici: goblet squat con manubrio)</w:t>
+      </w:r>
+    </w:p>
+    <w:p>
+      <w:pPr>
+        <w:pStyle w:val="ListParagraph"/>
+        <w:numPr>
+          <w:ilvl w:val="0"/>
+          <w:numId w:val="2"/>
+        </w:numPr>
+      </w:pPr>
+      <w:r>
+        <w:t>Sollevamento sulle punte — 1 × 15</w:t>
+      </w:r>
+    </w:p>
+    <w:p>
+      <w:pPr>
+        <w:pStyle w:val="Heading3"/>
+      </w:pPr>
+      <w:r>
+        <w:t>Stazione 2 — Affondo</w:t>
       </w:r>
     </w:p>
     <w:p>
@@ -57,34 +77,30 @@
     </w:p>
     <w:p>
       <w:pPr>
-        <w:pStyle w:val="ListParagraph"/>
-        <w:numPr>
-          <w:ilvl w:val="0"/>
-          <w:numId w:val="2"/>
-        </w:numPr>
-      </w:pPr>
-      <w:r>
-        <w:t>Sollevamento sulle punte — 1 × 15 a gambe tese, poi 1 × 12 a ginocchia piegate</w:t>
-      </w:r>
-    </w:p>
-    <w:p>
-      <w:pPr>
-        <w:pStyle w:val="Heading3"/>
-      </w:pPr>
-      <w:r>
-        <w:t>Stazione 2 — Catena posteriore — 10 minuti</w:t>
-      </w:r>
-    </w:p>
-    <w:p>
-      <w:pPr>
-        <w:pStyle w:val="ListParagraph"/>
-        <w:numPr>
-          <w:ilvl w:val="0"/>
-          <w:numId w:val="2"/>
-        </w:numPr>
-      </w:pPr>
-      <w:r>
-        <w:t>Stacco rumeno con bilanciere — 3 × 6, il bilanciere resta a contatto con le gambe in discesa, margine 3</w:t>
+        <w:pStyle w:val="Heading3"/>
+      </w:pPr>
+      <w:r>
+        <w:t>Stazione 3 — Stacco</w:t>
+      </w:r>
+    </w:p>
+    <w:p>
+      <w:pPr>
+        <w:pStyle w:val="ListParagraph"/>
+        <w:numPr>
+          <w:ilvl w:val="0"/>
+          <w:numId w:val="2"/>
+        </w:numPr>
+      </w:pPr>
+      <w:r>
+        <w:t>Stacco rumeno con bilanciere — 2 × 6, il bilanciere resta a contatto con le gambe in discesa, margine 3</w:t>
+      </w:r>
+    </w:p>
+    <w:p>
+      <w:pPr>
+        <w:pStyle w:val="Heading3"/>
+      </w:pPr>
+      <w:r>
+        <w:t>Stazione 4 — Hip thrust</w:t>
       </w:r>
     </w:p>
     <w:p>
@@ -104,36 +120,64 @@
         <w:pStyle w:val="Heading3"/>
       </w:pPr>
       <w:r>
-        <w:t>Stazione 3 — Spinta e trazione — 10 minuti</w:t>
-      </w:r>
-    </w:p>
-    <w:p>
-      <w:r>
-        <w:t>Rapporto 2:1 tra tirare e spingere: la schiacciata carica già la spalla in spinta, qui si bilancia con la trazione.</w:t>
-      </w:r>
-    </w:p>
-    <w:p>
-      <w:pPr>
-        <w:pStyle w:val="ListParagraph"/>
-        <w:numPr>
-          <w:ilvl w:val="0"/>
-          <w:numId w:val="2"/>
-        </w:numPr>
-      </w:pPr>
-      <w:r>
-        <w:t>Panca piana con bilanciere — 3 × 6, margine 3 (chi non ha i requisiti: spinte con manubri)</w:t>
-      </w:r>
-    </w:p>
-    <w:p>
-      <w:pPr>
-        <w:pStyle w:val="ListParagraph"/>
-        <w:numPr>
-          <w:ilvl w:val="0"/>
-          <w:numId w:val="2"/>
-        </w:numPr>
-      </w:pPr>
-      <w:r>
-        <w:t>Trazioni alla sbarra, assistite con elastico se necessario — 3 × 6-8</w:t>
+        <w:t>Stazione 5 — Panca</w:t>
+      </w:r>
+    </w:p>
+    <w:p>
+      <w:r>
+        <w:t>Rapporto 2:1 tra tirare e spingere nell'insieme delle stazioni 5-7: la schiacciata carica già la spalla in spinta.</w:t>
+      </w:r>
+    </w:p>
+    <w:p>
+      <w:pPr>
+        <w:pStyle w:val="ListParagraph"/>
+        <w:numPr>
+          <w:ilvl w:val="0"/>
+          <w:numId w:val="2"/>
+        </w:numPr>
+      </w:pPr>
+      <w:r>
+        <w:t>Panca piana con bilanciere — 2 × 6, margine 3 (chi non ha i requisiti: spinte con manubri)</w:t>
+      </w:r>
+    </w:p>
+    <w:p>
+      <w:pPr>
+        <w:pStyle w:val="ListParagraph"/>
+        <w:numPr>
+          <w:ilvl w:val="0"/>
+          <w:numId w:val="2"/>
+        </w:numPr>
+      </w:pPr>
+      <w:r>
+        <w:t>Cuffia dei rotatori con elastico — 1 × 15 per lato</w:t>
+      </w:r>
+    </w:p>
+    <w:p>
+      <w:pPr>
+        <w:pStyle w:val="Heading3"/>
+      </w:pPr>
+      <w:r>
+        <w:t>Stazione 6 — Trazione</w:t>
+      </w:r>
+    </w:p>
+    <w:p>
+      <w:pPr>
+        <w:pStyle w:val="ListParagraph"/>
+        <w:numPr>
+          <w:ilvl w:val="0"/>
+          <w:numId w:val="2"/>
+        </w:numPr>
+      </w:pPr>
+      <w:r>
+        <w:t>Trazioni alla sbarra, assistite con elastico se necessario — 2 × 6-8</w:t>
+      </w:r>
+    </w:p>
+    <w:p>
+      <w:pPr>
+        <w:pStyle w:val="Heading3"/>
+      </w:pPr>
+      <w:r>
+        <w:t>Stazione 7 — Rematore</w:t>
       </w:r>
     </w:p>
     <w:p>
@@ -150,58 +194,34 @@
     </w:p>
     <w:p>
       <w:pPr>
-        <w:pStyle w:val="ListParagraph"/>
-        <w:numPr>
-          <w:ilvl w:val="0"/>
-          <w:numId w:val="2"/>
-        </w:numPr>
-      </w:pPr>
-      <w:r>
-        <w:t>Cuffia dei rotatori con elastico — 2 × 15 per lato</w:t>
-      </w:r>
-    </w:p>
-    <w:p>
-      <w:pPr>
-        <w:pStyle w:val="Heading3"/>
-      </w:pPr>
-      <w:r>
-        <w:t>Stazione 4 — Core e potenza — 10 minuti</w:t>
-      </w:r>
-    </w:p>
-    <w:p>
-      <w:pPr>
-        <w:pStyle w:val="ListParagraph"/>
-        <w:numPr>
-          <w:ilvl w:val="0"/>
-          <w:numId w:val="2"/>
-        </w:numPr>
-      </w:pPr>
-      <w:r>
-        <w:t>Lancio rotazionale con palla medica contro il muro — 3 × 6 per lato</w:t>
-      </w:r>
-    </w:p>
-    <w:p>
-      <w:pPr>
-        <w:pStyle w:val="ListParagraph"/>
-        <w:numPr>
-          <w:ilvl w:val="0"/>
-          <w:numId w:val="2"/>
-        </w:numPr>
-      </w:pPr>
-      <w:r>
-        <w:t>Pallof press con elastico — 3 × 10″ di tenuta per lato</w:t>
-      </w:r>
-    </w:p>
-    <w:p>
-      <w:pPr>
-        <w:pStyle w:val="ListParagraph"/>
-        <w:numPr>
-          <w:ilvl w:val="0"/>
-          <w:numId w:val="2"/>
-        </w:numPr>
-      </w:pPr>
-      <w:r>
-        <w:t>Plank con spinta in appoggio instabile — 2 × 30″</w:t>
+        <w:pStyle w:val="Heading3"/>
+      </w:pPr>
+      <w:r>
+        <w:t>Stazione 8 — Core e potenza</w:t>
+      </w:r>
+    </w:p>
+    <w:p>
+      <w:pPr>
+        <w:pStyle w:val="ListParagraph"/>
+        <w:numPr>
+          <w:ilvl w:val="0"/>
+          <w:numId w:val="2"/>
+        </w:numPr>
+      </w:pPr>
+      <w:r>
+        <w:t>Lancio rotazionale con palla medica contro il muro — 2 × 6 per lato</w:t>
+      </w:r>
+    </w:p>
+    <w:p>
+      <w:pPr>
+        <w:pStyle w:val="ListParagraph"/>
+        <w:numPr>
+          <w:ilvl w:val="0"/>
+          <w:numId w:val="2"/>
+        </w:numPr>
+      </w:pPr>
+      <w:r>
+        <w:t>Pallof press con elastico — 1 × 10″ di tenuta per lato</w:t>
       </w:r>
     </w:p>
     <w:sectPr>

</xml_diff>